<commit_message>
Update database application forms [skip deploy]
</commit_message>
<xml_diff>
--- a/public/templates/DOC-8.docx
+++ b/public/templates/DOC-8.docx
@@ -1089,7 +1089,7 @@
                 <w:sz w:val="24"/>
                 <w:szCs w:val="24"/>
               </w:rPr>
-              <w:t>________________________________________</w:t>
+              <w:t>{purpose_other_detail}</w:t>
             </w:r>
           </w:p>
         </w:tc>
@@ -1750,6 +1750,9 @@
                 <w:szCs w:val="24"/>
               </w:rPr>
             </w:pPr>
+            <w:r>
+              <w:t>{db_usage_scope}</w:t>
+            </w:r>
           </w:p>
           <w:p>
             <w:pPr>
@@ -3467,6 +3470,9 @@
                 <w:szCs w:val="24"/>
               </w:rPr>
             </w:pPr>
+            <w:r>
+              <w:t xml:space="preserve">{apply_system_text}</w:t>
+            </w:r>
           </w:p>
         </w:tc>
         <w:tc>
@@ -3554,6 +3560,9 @@
                 <w:szCs w:val="24"/>
               </w:rPr>
             </w:pPr>
+            <w:r>
+              <w:t xml:space="preserve">{apply_condition}</w:t>
+            </w:r>
           </w:p>
         </w:tc>
         <w:tc>
@@ -3623,6 +3632,9 @@
                 <w:szCs w:val="24"/>
               </w:rPr>
             </w:pPr>
+            <w:r>
+              <w:t xml:space="preserve">{apply_year_text}</w:t>
+            </w:r>
           </w:p>
         </w:tc>
       </w:tr>
@@ -3810,7 +3822,7 @@
                 <w:sz w:val="24"/>
                 <w:szCs w:val="24"/>
               </w:rPr>
-              <w:t>1</w:t>
+              <w:t xml:space="preserve">{#data_field_rows}{field_index}</w:t>
             </w:r>
           </w:p>
         </w:tc>
@@ -3842,6 +3854,9 @@
                 <w:szCs w:val="24"/>
               </w:rPr>
             </w:pPr>
+            <w:r>
+              <w:t xml:space="preserve">{field_name}</w:t>
+            </w:r>
           </w:p>
         </w:tc>
         <w:tc>
@@ -3873,230 +3888,9 @@
                 <w:szCs w:val="24"/>
               </w:rPr>
             </w:pPr>
-          </w:p>
-        </w:tc>
-      </w:tr>
-      <w:tr>
-        <w:trPr>
-          <w:trHeight w:val="480"/>
-          <w:jc w:val="center"/>
-        </w:trPr>
-        <w:tc>
-          <w:tcPr>
-            <w:tcW w:w="1408" w:type="dxa"/>
-            <w:tcBorders>
-              <w:top w:val="dotted" w:sz="4" w:space="0" w:color="000000"/>
-              <w:left w:val="single" w:sz="8" w:space="0" w:color="000000"/>
-              <w:bottom w:val="dotted" w:sz="4" w:space="0" w:color="000000"/>
-              <w:right w:val="dotted" w:sz="4" w:space="0" w:color="000000"/>
-            </w:tcBorders>
-            <w:tcMar>
-              <w:top w:w="100" w:type="dxa"/>
-              <w:left w:w="100" w:type="dxa"/>
-              <w:bottom w:w="100" w:type="dxa"/>
-              <w:right w:w="100" w:type="dxa"/>
-            </w:tcMar>
-            <w:vAlign w:val="center"/>
-          </w:tcPr>
-          <w:p>
-            <w:pPr>
-              <w:widowControl w:val="0"/>
-              <w:pBdr>
-                <w:top w:val="nil"/>
-                <w:left w:val="nil"/>
-                <w:bottom w:val="nil"/>
-                <w:right w:val="nil"/>
-                <w:between w:val="nil"/>
-              </w:pBdr>
-              <w:spacing w:line="240" w:lineRule="auto"/>
-              <w:jc w:val="center"/>
-              <w:rPr>
-                <w:rFonts w:ascii="DFKai-SB" w:eastAsia="DFKai-SB" w:hAnsi="DFKai-SB" w:cs="Times New Roman"/>
-                <w:sz w:val="24"/>
-                <w:szCs w:val="24"/>
-              </w:rPr>
-            </w:pPr>
-            <w:r>
-              <w:rPr>
-                <w:rFonts w:ascii="DFKai-SB" w:eastAsia="DFKai-SB" w:hAnsi="DFKai-SB" w:cs="Times New Roman"/>
-                <w:sz w:val="24"/>
-                <w:szCs w:val="24"/>
-              </w:rPr>
-              <w:t>2</w:t>
-            </w:r>
-          </w:p>
-        </w:tc>
-        <w:tc>
-          <w:tcPr>
-            <w:tcW w:w="1843" w:type="dxa"/>
-            <w:tcBorders>
-              <w:top w:val="dotted" w:sz="4" w:space="0" w:color="000000"/>
-              <w:left w:val="dotted" w:sz="4" w:space="0" w:color="000000"/>
-              <w:bottom w:val="dotted" w:sz="4" w:space="0" w:color="000000"/>
-              <w:right w:val="dotted" w:sz="4" w:space="0" w:color="000000"/>
-            </w:tcBorders>
-            <w:vAlign w:val="center"/>
-          </w:tcPr>
-          <w:p>
-            <w:pPr>
-              <w:widowControl w:val="0"/>
-              <w:pBdr>
-                <w:top w:val="nil"/>
-                <w:left w:val="nil"/>
-                <w:bottom w:val="nil"/>
-                <w:right w:val="nil"/>
-                <w:between w:val="nil"/>
-              </w:pBdr>
-              <w:spacing w:line="240" w:lineRule="auto"/>
-              <w:rPr>
-                <w:rFonts w:ascii="DFKai-SB" w:eastAsia="DFKai-SB" w:hAnsi="DFKai-SB" w:cs="Times New Roman"/>
-                <w:sz w:val="24"/>
-                <w:szCs w:val="24"/>
-              </w:rPr>
-            </w:pPr>
-          </w:p>
-        </w:tc>
-        <w:tc>
-          <w:tcPr>
-            <w:tcW w:w="6649" w:type="dxa"/>
-            <w:gridSpan w:val="4"/>
-            <w:tcBorders>
-              <w:top w:val="dotted" w:sz="4" w:space="0" w:color="000000"/>
-              <w:left w:val="dotted" w:sz="4" w:space="0" w:color="000000"/>
-              <w:bottom w:val="dotted" w:sz="4" w:space="0" w:color="000000"/>
-              <w:right w:val="single" w:sz="8" w:space="0" w:color="000000"/>
-            </w:tcBorders>
-            <w:vAlign w:val="center"/>
-          </w:tcPr>
-          <w:p>
-            <w:pPr>
-              <w:widowControl w:val="0"/>
-              <w:pBdr>
-                <w:top w:val="nil"/>
-                <w:left w:val="nil"/>
-                <w:bottom w:val="nil"/>
-                <w:right w:val="nil"/>
-                <w:between w:val="nil"/>
-              </w:pBdr>
-              <w:spacing w:line="240" w:lineRule="auto"/>
-              <w:rPr>
-                <w:rFonts w:ascii="DFKai-SB" w:eastAsia="DFKai-SB" w:hAnsi="DFKai-SB" w:cs="Times New Roman"/>
-                <w:sz w:val="24"/>
-                <w:szCs w:val="24"/>
-              </w:rPr>
-            </w:pPr>
-          </w:p>
-        </w:tc>
-      </w:tr>
-      <w:tr>
-        <w:trPr>
-          <w:trHeight w:val="480"/>
-          <w:jc w:val="center"/>
-        </w:trPr>
-        <w:tc>
-          <w:tcPr>
-            <w:tcW w:w="1408" w:type="dxa"/>
-            <w:tcBorders>
-              <w:top w:val="dotted" w:sz="4" w:space="0" w:color="000000"/>
-              <w:left w:val="single" w:sz="8" w:space="0" w:color="000000"/>
-              <w:bottom w:val="single" w:sz="8" w:space="0" w:color="000000"/>
-              <w:right w:val="dotted" w:sz="4" w:space="0" w:color="000000"/>
-            </w:tcBorders>
-            <w:tcMar>
-              <w:top w:w="100" w:type="dxa"/>
-              <w:left w:w="100" w:type="dxa"/>
-              <w:bottom w:w="100" w:type="dxa"/>
-              <w:right w:w="100" w:type="dxa"/>
-            </w:tcMar>
-            <w:vAlign w:val="center"/>
-          </w:tcPr>
-          <w:p>
-            <w:pPr>
-              <w:widowControl w:val="0"/>
-              <w:pBdr>
-                <w:top w:val="nil"/>
-                <w:left w:val="nil"/>
-                <w:bottom w:val="nil"/>
-                <w:right w:val="nil"/>
-                <w:between w:val="nil"/>
-              </w:pBdr>
-              <w:spacing w:line="240" w:lineRule="auto"/>
-              <w:jc w:val="center"/>
-              <w:rPr>
-                <w:rFonts w:ascii="DFKai-SB" w:eastAsia="DFKai-SB" w:hAnsi="DFKai-SB" w:cs="Times New Roman"/>
-                <w:sz w:val="24"/>
-                <w:szCs w:val="24"/>
-              </w:rPr>
-            </w:pPr>
-            <w:r>
-              <w:rPr>
-                <w:rFonts w:ascii="DFKai-SB" w:eastAsia="DFKai-SB" w:hAnsi="DFKai-SB" w:cs="Times New Roman"/>
-                <w:sz w:val="24"/>
-                <w:szCs w:val="24"/>
-              </w:rPr>
-              <w:t>3</w:t>
-            </w:r>
-          </w:p>
-        </w:tc>
-        <w:tc>
-          <w:tcPr>
-            <w:tcW w:w="1843" w:type="dxa"/>
-            <w:tcBorders>
-              <w:top w:val="dotted" w:sz="4" w:space="0" w:color="000000"/>
-              <w:left w:val="dotted" w:sz="4" w:space="0" w:color="000000"/>
-              <w:bottom w:val="single" w:sz="8" w:space="0" w:color="000000"/>
-              <w:right w:val="dotted" w:sz="4" w:space="0" w:color="000000"/>
-            </w:tcBorders>
-            <w:vAlign w:val="center"/>
-          </w:tcPr>
-          <w:p>
-            <w:pPr>
-              <w:widowControl w:val="0"/>
-              <w:pBdr>
-                <w:top w:val="nil"/>
-                <w:left w:val="nil"/>
-                <w:bottom w:val="nil"/>
-                <w:right w:val="nil"/>
-                <w:between w:val="nil"/>
-              </w:pBdr>
-              <w:spacing w:line="240" w:lineRule="auto"/>
-              <w:rPr>
-                <w:rFonts w:ascii="DFKai-SB" w:eastAsia="DFKai-SB" w:hAnsi="DFKai-SB" w:cs="Times New Roman"/>
-                <w:sz w:val="24"/>
-                <w:szCs w:val="24"/>
-              </w:rPr>
-            </w:pPr>
-          </w:p>
-        </w:tc>
-        <w:tc>
-          <w:tcPr>
-            <w:tcW w:w="6649" w:type="dxa"/>
-            <w:gridSpan w:val="4"/>
-            <w:tcBorders>
-              <w:top w:val="dotted" w:sz="4" w:space="0" w:color="000000"/>
-              <w:left w:val="dotted" w:sz="4" w:space="0" w:color="000000"/>
-              <w:bottom w:val="single" w:sz="8" w:space="0" w:color="000000"/>
-              <w:right w:val="single" w:sz="8" w:space="0" w:color="000000"/>
-            </w:tcBorders>
-            <w:vAlign w:val="center"/>
-          </w:tcPr>
-          <w:p>
-            <w:pPr>
-              <w:widowControl w:val="0"/>
-              <w:pBdr>
-                <w:top w:val="nil"/>
-                <w:left w:val="nil"/>
-                <w:bottom w:val="nil"/>
-                <w:right w:val="nil"/>
-                <w:between w:val="nil"/>
-              </w:pBdr>
-              <w:spacing w:line="240" w:lineRule="auto"/>
-              <w:rPr>
-                <w:rFonts w:ascii="DFKai-SB" w:eastAsia="DFKai-SB" w:hAnsi="DFKai-SB" w:cs="Times New Roman"/>
-                <w:sz w:val="24"/>
-                <w:szCs w:val="24"/>
-              </w:rPr>
-            </w:pPr>
+            <w:r>
+              <w:t xml:space="preserve">{apply_purpose_text}{/data_field_rows}</w:t>
+            </w:r>
           </w:p>
         </w:tc>
       </w:tr>

</xml_diff>